<commit_message>
Update offer pipeline and template
</commit_message>
<xml_diff>
--- a/ORBIT-I/templates/offer_template.docx
+++ b/ORBIT-I/templates/offer_template.docx
@@ -4,30 +4,42 @@
   <w:body>
     <w:tbl>
       <w:tblPr>
-        <w:tblW w:type="pct" w:w="100%"/>
+        <w:tblW w:type="dxa" w:w="9360"/>
         <w:tblBorders>
-          <w:top w:val="none" w:color="FFFFFF" w:sz="0"/>
-          <w:left w:val="none" w:color="FFFFFF" w:sz="0"/>
-          <w:bottom w:val="none" w:color="FFFFFF" w:sz="0"/>
-          <w:right w:val="none" w:color="FFFFFF" w:sz="0"/>
-          <w:insideH w:val="none" w:color="FFFFFF" w:sz="0"/>
-          <w:insideV w:val="none" w:color="FFFFFF" w:sz="0"/>
+          <w:top w:val="single" w:color="auto" w:sz="4"/>
+          <w:left w:val="single" w:color="auto" w:sz="4"/>
+          <w:bottom w:val="single" w:color="auto" w:sz="4"/>
+          <w:right w:val="single" w:color="auto" w:sz="4"/>
+          <w:insideH w:val="single" w:color="auto" w:sz="4"/>
+          <w:insideV w:val="single" w:color="auto" w:sz="4"/>
         </w:tblBorders>
       </w:tblPr>
       <w:tblGrid>
-        <w:gridCol w:w="1400"/>
-        <w:gridCol w:w="8800"/>
+        <w:gridCol w:w="1800"/>
+        <w:gridCol w:w="7560"/>
       </w:tblGrid>
       <w:tr>
         <w:tc>
           <w:tcPr>
-            <w:tcW w:type="dxa" w:w="1400"/>
-          </w:tcPr>
-          <w:p>
+            <w:tcW w:type="dxa" w:w="1800"/>
+            <w:tcBorders>
+              <w:top w:val="none" w:color="FFFFFF" w:sz="0"/>
+              <w:left w:val="none" w:color="FFFFFF" w:sz="0"/>
+              <w:bottom w:val="none" w:color="FFFFFF" w:sz="0"/>
+              <w:right w:val="none" w:color="FFFFFF" w:sz="0"/>
+            </w:tcBorders>
+            <w:shd w:fill="060d1a" w:val="clear"/>
+            <w:vAlign w:val="center"/>
+          </w:tcPr>
+          <w:p>
+            <w:pPr>
+              <w:spacing w:after="80" w:before="80"/>
+              <w:jc w:val="center"/>
+            </w:pPr>
             <w:r>
               <w:drawing>
                 <wp:inline distT="0" distB="0" distL="0" distR="0">
-                  <wp:extent cx="523875" cy="400050"/>
+                  <wp:extent cx="952500" cy="952500"/>
                   <wp:effectExtent t="0" r="0" b="0" l="0"/>
                   <wp:docPr id="1" name="" descr="" title=""/>
                   <wp:cNvGraphicFramePr>
@@ -52,7 +64,7 @@
                         <pic:spPr bwMode="auto">
                           <a:xfrm>
                             <a:off x="0" y="0"/>
-                            <a:ext cx="523875" cy="400050"/>
+                            <a:ext cx="952500" cy="952500"/>
                           </a:xfrm>
                           <a:prstGeom prst="rect">
                             <a:avLst/>
@@ -68,187 +80,992 @@
         </w:tc>
         <w:tc>
           <w:tcPr>
-            <w:tcW w:type="dxa" w:w="8800"/>
-          </w:tcPr>
-          <w:p>
-            <w:r>
-              <w:rPr>
+            <w:tcW w:type="dxa" w:w="7560"/>
+            <w:tcBorders>
+              <w:top w:val="none" w:color="FFFFFF" w:sz="0"/>
+              <w:left w:val="none" w:color="FFFFFF" w:sz="0"/>
+              <w:bottom w:val="none" w:color="FFFFFF" w:sz="0"/>
+              <w:right w:val="none" w:color="FFFFFF" w:sz="0"/>
+            </w:tcBorders>
+            <w:shd w:fill="1a73e8" w:val="clear"/>
+            <w:vAlign w:val="center"/>
+          </w:tcPr>
+          <w:p>
+            <w:pPr>
+              <w:spacing w:after="60" w:before="120"/>
+              <w:ind w:left="240"/>
+            </w:pPr>
+            <w:r>
+              <w:rPr>
+                <w:rFonts w:ascii="Calibri" w:cs="Calibri" w:eastAsia="Calibri" w:hAnsi="Calibri"/>
                 <w:b/>
                 <w:bCs/>
-                <w:color w:val="17284D"/>
-                <w:sz w:val="32"/>
-                <w:szCs w:val="32"/>
+                <w:color w:val="FFFFFF"/>
+                <w:sz w:val="40"/>
+                <w:szCs w:val="40"/>
               </w:rPr>
               <w:t xml:space="preserve">ORBIT-I</w:t>
             </w:r>
           </w:p>
           <w:p>
-            <w:r>
-              <w:rPr>
-                <w:color w:val="6B7280"/>
+            <w:pPr>
+              <w:spacing w:after="40"/>
+              <w:ind w:left="240"/>
+            </w:pPr>
+            <w:r>
+              <w:rPr>
+                <w:rFonts w:ascii="Calibri" w:cs="Calibri" w:eastAsia="Calibri" w:hAnsi="Calibri"/>
+                <w:color w:val="c7d9f8"/>
                 <w:sz w:val="18"/>
                 <w:szCs w:val="18"/>
               </w:rPr>
-              <w:t xml:space="preserve">Building Ideas, Creating Impacts</w:t>
+              <w:t xml:space="preserve">CV Intelligence &amp; Offer Automation Platform</w:t>
+            </w:r>
+          </w:p>
+          <w:p>
+            <w:pPr>
+              <w:spacing w:after="120"/>
+              <w:ind w:left="240"/>
+            </w:pPr>
+            <w:r>
+              <w:rPr>
+                <w:rFonts w:ascii="Calibri" w:cs="Calibri" w:eastAsia="Calibri" w:hAnsi="Calibri"/>
+                <w:color w:val="93bfef"/>
+                <w:sz w:val="16"/>
+                <w:szCs w:val="16"/>
+              </w:rPr>
+              <w:t xml:space="preserve">Karachi, Sindh, Pakistan  ·  orbiti2026@gmail.com</w:t>
             </w:r>
           </w:p>
         </w:tc>
       </w:tr>
     </w:tbl>
+    <w:p/>
+    <w:tbl>
+      <w:tblPr>
+        <w:tblW w:type="dxa" w:w="9360"/>
+        <w:tblBorders>
+          <w:top w:val="single" w:color="auto" w:sz="4"/>
+          <w:left w:val="single" w:color="auto" w:sz="4"/>
+          <w:bottom w:val="single" w:color="auto" w:sz="4"/>
+          <w:right w:val="single" w:color="auto" w:sz="4"/>
+          <w:insideH w:val="single" w:color="auto" w:sz="4"/>
+          <w:insideV w:val="single" w:color="auto" w:sz="4"/>
+        </w:tblBorders>
+      </w:tblPr>
+      <w:tblGrid>
+        <w:gridCol w:w="4680"/>
+        <w:gridCol w:w="4680"/>
+      </w:tblGrid>
+      <w:tr>
+        <w:tc>
+          <w:tcPr>
+            <w:tcW w:type="dxa" w:w="4680"/>
+            <w:tcBorders>
+              <w:top w:val="none" w:color="FFFFFF" w:sz="0"/>
+              <w:left w:val="none" w:color="FFFFFF" w:sz="0"/>
+              <w:bottom w:val="none" w:color="FFFFFF" w:sz="0"/>
+              <w:right w:val="none" w:color="FFFFFF" w:sz="0"/>
+            </w:tcBorders>
+          </w:tcPr>
+          <w:p>
+            <w:r>
+              <w:rPr>
+                <w:rFonts w:ascii="Calibri" w:cs="Calibri" w:eastAsia="Calibri" w:hAnsi="Calibri"/>
+                <w:b/>
+                <w:bCs/>
+                <w:color w:val="1e293b"/>
+                <w:sz w:val="20"/>
+                <w:szCs w:val="20"/>
+              </w:rPr>
+              <w:t xml:space="preserve">Date: </w:t>
+            </w:r>
+            <w:r>
+              <w:rPr>
+                <w:rFonts w:ascii="Calibri" w:cs="Calibri" w:eastAsia="Calibri" w:hAnsi="Calibri"/>
+                <w:color w:val="1e293b"/>
+                <w:sz w:val="20"/>
+                <w:szCs w:val="20"/>
+              </w:rPr>
+              <w:t xml:space="preserve">{{offer_date}}</w:t>
+            </w:r>
+          </w:p>
+        </w:tc>
+        <w:tc>
+          <w:tcPr>
+            <w:tcW w:type="dxa" w:w="4680"/>
+            <w:tcBorders>
+              <w:top w:val="none" w:color="FFFFFF" w:sz="0"/>
+              <w:left w:val="none" w:color="FFFFFF" w:sz="0"/>
+              <w:bottom w:val="none" w:color="FFFFFF" w:sz="0"/>
+              <w:right w:val="none" w:color="FFFFFF" w:sz="0"/>
+            </w:tcBorders>
+          </w:tcPr>
+          <w:p>
+            <w:pPr>
+              <w:jc w:val="right"/>
+            </w:pPr>
+            <w:r>
+              <w:rPr>
+                <w:rFonts w:ascii="Calibri" w:cs="Calibri" w:eastAsia="Calibri" w:hAnsi="Calibri"/>
+                <w:color w:val="94a3b8"/>
+                <w:sz w:val="20"/>
+                <w:szCs w:val="20"/>
+              </w:rPr>
+              <w:t xml:space="preserve">Ref: ORBIT-I/OL/2026</w:t>
+            </w:r>
+          </w:p>
+        </w:tc>
+      </w:tr>
+    </w:tbl>
+    <w:p/>
     <w:p>
       <w:pPr>
-        <w:pBdr>
-          <w:bottom w:val="single" w:color="2E5AAC" w:sz="20"/>
-        </w:pBdr>
         <w:spacing w:after="200" w:before="200"/>
       </w:pPr>
       <w:r>
-        <w:t xml:space="preserve"/>
+        <w:rPr>
+          <w:rFonts w:ascii="Calibri" w:cs="Calibri" w:eastAsia="Calibri" w:hAnsi="Calibri"/>
+          <w:b/>
+          <w:bCs/>
+          <w:color w:val="1e293b"/>
+          <w:sz w:val="24"/>
+          <w:szCs w:val="24"/>
+        </w:rPr>
+        <w:t xml:space="preserve">Dear {{candidate_name}},</w:t>
       </w:r>
     </w:p>
     <w:p>
       <w:pPr>
-        <w:spacing w:after="100" w:before="200"/>
-      </w:pPr>
-      <w:r>
-        <w:rPr>
+        <w:spacing w:after="300"/>
+      </w:pPr>
+      <w:r>
+        <w:rPr>
+          <w:rFonts w:ascii="Calibri" w:cs="Calibri" w:eastAsia="Calibri" w:hAnsi="Calibri"/>
+          <w:color w:val="1e293b"/>
+          <w:sz w:val="21"/>
+          <w:szCs w:val="21"/>
+        </w:rPr>
+        <w:t xml:space="preserve">We are pleased to extend this formal offer of employment for the position of </w:t>
+      </w:r>
+      <w:r>
+        <w:rPr>
+          <w:rFonts w:ascii="Calibri" w:cs="Calibri" w:eastAsia="Calibri" w:hAnsi="Calibri"/>
           <w:b/>
           <w:bCs/>
-          <w:color w:val="17284D"/>
-          <w:sz w:val="30"/>
-          <w:szCs w:val="30"/>
-        </w:rPr>
-        <w:t xml:space="preserve">OFFER LETTER</w:t>
+          <w:color w:val="1a73e8"/>
+          <w:sz w:val="21"/>
+          <w:szCs w:val="21"/>
+        </w:rPr>
+        <w:t xml:space="preserve">{{position_title}}</w:t>
+      </w:r>
+      <w:r>
+        <w:rPr>
+          <w:rFonts w:ascii="Calibri" w:cs="Calibri" w:eastAsia="Calibri" w:hAnsi="Calibri"/>
+          <w:color w:val="1e293b"/>
+          <w:sz w:val="21"/>
+          <w:szCs w:val="21"/>
+        </w:rPr>
+        <w:t xml:space="preserve"> within the </w:t>
+      </w:r>
+      <w:r>
+        <w:rPr>
+          <w:rFonts w:ascii="Calibri" w:cs="Calibri" w:eastAsia="Calibri" w:hAnsi="Calibri"/>
+          <w:b/>
+          <w:bCs/>
+          <w:color w:val="1a73e8"/>
+          <w:sz w:val="21"/>
+          <w:szCs w:val="21"/>
+        </w:rPr>
+        <w:t xml:space="preserve">{{domain}}</w:t>
+      </w:r>
+      <w:r>
+        <w:rPr>
+          <w:rFonts w:ascii="Calibri" w:cs="Calibri" w:eastAsia="Calibri" w:hAnsi="Calibri"/>
+          <w:color w:val="1e293b"/>
+          <w:sz w:val="21"/>
+          <w:szCs w:val="21"/>
+        </w:rPr>
+        <w:t xml:space="preserve"> department at </w:t>
+      </w:r>
+      <w:r>
+        <w:rPr>
+          <w:rFonts w:ascii="Calibri" w:cs="Calibri" w:eastAsia="Calibri" w:hAnsi="Calibri"/>
+          <w:b/>
+          <w:bCs/>
+          <w:color w:val="1e293b"/>
+          <w:sz w:val="21"/>
+          <w:szCs w:val="21"/>
+        </w:rPr>
+        <w:t xml:space="preserve">ORBIT-I</w:t>
+      </w:r>
+      <w:r>
+        <w:rPr>
+          <w:rFonts w:ascii="Calibri" w:cs="Calibri" w:eastAsia="Calibri" w:hAnsi="Calibri"/>
+          <w:color w:val="1e293b"/>
+          <w:sz w:val="21"/>
+          <w:szCs w:val="21"/>
+        </w:rPr>
+        <w:t xml:space="preserve">. We believe your skills and experience make you an excellent fit for our team.</w:t>
       </w:r>
     </w:p>
     <w:p>
-      <w:r>
-        <w:rPr>
-          <w:color w:val="6B7280"/>
-          <w:sz w:val="20"/>
-          <w:szCs w:val="20"/>
-        </w:rPr>
-        <w:t xml:space="preserve">{{ position_title }}</w:t>
+      <w:pPr>
+        <w:pBdr>
+          <w:bottom w:val="single" w:color="d1e3ff" w:sz="1"/>
+        </w:pBdr>
+        <w:spacing w:after="160" w:before="200"/>
+      </w:pPr>
+      <w:r>
+        <w:rPr>
+          <w:rFonts w:ascii="Calibri" w:cs="Calibri" w:eastAsia="Calibri" w:hAnsi="Calibri"/>
+          <w:b/>
+          <w:bCs/>
+          <w:color w:val="1a73e8"/>
+          <w:sz w:val="22"/>
+          <w:szCs w:val="22"/>
+        </w:rPr>
+        <w:t xml:space="preserve">Employment Details</w:t>
+      </w:r>
+    </w:p>
+    <w:tbl>
+      <w:tblPr>
+        <w:tblW w:type="dxa" w:w="9360"/>
+        <w:tblBorders>
+          <w:top w:val="single" w:color="auto" w:sz="4"/>
+          <w:left w:val="single" w:color="auto" w:sz="4"/>
+          <w:bottom w:val="single" w:color="auto" w:sz="4"/>
+          <w:right w:val="single" w:color="auto" w:sz="4"/>
+          <w:insideH w:val="single" w:color="auto" w:sz="4"/>
+          <w:insideV w:val="single" w:color="auto" w:sz="4"/>
+        </w:tblBorders>
+      </w:tblPr>
+      <w:tblGrid>
+        <w:gridCol w:w="3000"/>
+        <w:gridCol w:w="6360"/>
+      </w:tblGrid>
+      <w:tr>
+        <w:tc>
+          <w:tcPr>
+            <w:tcW w:type="dxa" w:w="3000"/>
+            <w:tcBorders>
+              <w:top w:val="none" w:color="FFFFFF" w:sz="0"/>
+              <w:left w:val="none" w:color="FFFFFF" w:sz="0"/>
+              <w:bottom w:val="single" w:color="e2eaf4" w:sz="1"/>
+              <w:right w:val="none" w:color="FFFFFF" w:sz="0"/>
+            </w:tcBorders>
+            <w:shd w:fill="e8f0fe" w:val="clear"/>
+          </w:tcPr>
+          <w:p>
+            <w:pPr>
+              <w:spacing w:after="100" w:before="100"/>
+              <w:ind w:left="120"/>
+            </w:pPr>
+            <w:r>
+              <w:rPr>
+                <w:rFonts w:ascii="Calibri" w:cs="Calibri" w:eastAsia="Calibri" w:hAnsi="Calibri"/>
+                <w:b/>
+                <w:bCs/>
+                <w:color w:val="1e293b"/>
+                <w:sz w:val="19"/>
+                <w:szCs w:val="19"/>
+              </w:rPr>
+              <w:t xml:space="preserve">Position Title</w:t>
+            </w:r>
+          </w:p>
+        </w:tc>
+        <w:tc>
+          <w:tcPr>
+            <w:tcW w:type="dxa" w:w="6360"/>
+            <w:tcBorders>
+              <w:top w:val="none" w:color="FFFFFF" w:sz="0"/>
+              <w:left w:val="none" w:color="FFFFFF" w:sz="0"/>
+              <w:bottom w:val="single" w:color="e2eaf4" w:sz="1"/>
+              <w:right w:val="none" w:color="FFFFFF" w:sz="0"/>
+            </w:tcBorders>
+            <w:shd w:fill="e8f0fe" w:val="clear"/>
+          </w:tcPr>
+          <w:p>
+            <w:pPr>
+              <w:spacing w:after="100" w:before="100"/>
+              <w:ind w:left="120"/>
+            </w:pPr>
+            <w:r>
+              <w:rPr>
+                <w:rFonts w:ascii="Calibri" w:cs="Calibri" w:eastAsia="Calibri" w:hAnsi="Calibri"/>
+                <w:color w:val="1e293b"/>
+                <w:sz w:val="19"/>
+                <w:szCs w:val="19"/>
+              </w:rPr>
+              <w:t xml:space="preserve">{{position_title}}</w:t>
+            </w:r>
+          </w:p>
+        </w:tc>
+      </w:tr>
+      <w:tr>
+        <w:tc>
+          <w:tcPr>
+            <w:tcW w:type="dxa" w:w="3000"/>
+            <w:tcBorders>
+              <w:top w:val="none" w:color="FFFFFF" w:sz="0"/>
+              <w:left w:val="none" w:color="FFFFFF" w:sz="0"/>
+              <w:bottom w:val="single" w:color="e2eaf4" w:sz="1"/>
+              <w:right w:val="none" w:color="FFFFFF" w:sz="0"/>
+            </w:tcBorders>
+            <w:shd w:fill="FFFFFF" w:val="clear"/>
+          </w:tcPr>
+          <w:p>
+            <w:pPr>
+              <w:spacing w:after="100" w:before="100"/>
+              <w:ind w:left="120"/>
+            </w:pPr>
+            <w:r>
+              <w:rPr>
+                <w:rFonts w:ascii="Calibri" w:cs="Calibri" w:eastAsia="Calibri" w:hAnsi="Calibri"/>
+                <w:b/>
+                <w:bCs/>
+                <w:color w:val="1e293b"/>
+                <w:sz w:val="19"/>
+                <w:szCs w:val="19"/>
+              </w:rPr>
+              <w:t xml:space="preserve">Department / Domain</w:t>
+            </w:r>
+          </w:p>
+        </w:tc>
+        <w:tc>
+          <w:tcPr>
+            <w:tcW w:type="dxa" w:w="6360"/>
+            <w:tcBorders>
+              <w:top w:val="none" w:color="FFFFFF" w:sz="0"/>
+              <w:left w:val="none" w:color="FFFFFF" w:sz="0"/>
+              <w:bottom w:val="single" w:color="e2eaf4" w:sz="1"/>
+              <w:right w:val="none" w:color="FFFFFF" w:sz="0"/>
+            </w:tcBorders>
+            <w:shd w:fill="FFFFFF" w:val="clear"/>
+          </w:tcPr>
+          <w:p>
+            <w:pPr>
+              <w:spacing w:after="100" w:before="100"/>
+              <w:ind w:left="120"/>
+            </w:pPr>
+            <w:r>
+              <w:rPr>
+                <w:rFonts w:ascii="Calibri" w:cs="Calibri" w:eastAsia="Calibri" w:hAnsi="Calibri"/>
+                <w:color w:val="1e293b"/>
+                <w:sz w:val="19"/>
+                <w:szCs w:val="19"/>
+              </w:rPr>
+              <w:t xml:space="preserve">{{domain}}</w:t>
+            </w:r>
+          </w:p>
+        </w:tc>
+      </w:tr>
+      <w:tr>
+        <w:tc>
+          <w:tcPr>
+            <w:tcW w:type="dxa" w:w="3000"/>
+            <w:tcBorders>
+              <w:top w:val="none" w:color="FFFFFF" w:sz="0"/>
+              <w:left w:val="none" w:color="FFFFFF" w:sz="0"/>
+              <w:bottom w:val="single" w:color="e2eaf4" w:sz="1"/>
+              <w:right w:val="none" w:color="FFFFFF" w:sz="0"/>
+            </w:tcBorders>
+            <w:shd w:fill="e8f0fe" w:val="clear"/>
+          </w:tcPr>
+          <w:p>
+            <w:pPr>
+              <w:spacing w:after="100" w:before="100"/>
+              <w:ind w:left="120"/>
+            </w:pPr>
+            <w:r>
+              <w:rPr>
+                <w:rFonts w:ascii="Calibri" w:cs="Calibri" w:eastAsia="Calibri" w:hAnsi="Calibri"/>
+                <w:b/>
+                <w:bCs/>
+                <w:color w:val="1e293b"/>
+                <w:sz w:val="19"/>
+                <w:szCs w:val="19"/>
+              </w:rPr>
+              <w:t xml:space="preserve">Monthly Salary</w:t>
+            </w:r>
+          </w:p>
+        </w:tc>
+        <w:tc>
+          <w:tcPr>
+            <w:tcW w:type="dxa" w:w="6360"/>
+            <w:tcBorders>
+              <w:top w:val="none" w:color="FFFFFF" w:sz="0"/>
+              <w:left w:val="none" w:color="FFFFFF" w:sz="0"/>
+              <w:bottom w:val="single" w:color="e2eaf4" w:sz="1"/>
+              <w:right w:val="none" w:color="FFFFFF" w:sz="0"/>
+            </w:tcBorders>
+            <w:shd w:fill="e8f0fe" w:val="clear"/>
+          </w:tcPr>
+          <w:p>
+            <w:pPr>
+              <w:spacing w:after="100" w:before="100"/>
+              <w:ind w:left="120"/>
+            </w:pPr>
+            <w:r>
+              <w:rPr>
+                <w:rFonts w:ascii="Calibri" w:cs="Calibri" w:eastAsia="Calibri" w:hAnsi="Calibri"/>
+                <w:color w:val="1e293b"/>
+                <w:sz w:val="19"/>
+                <w:szCs w:val="19"/>
+              </w:rPr>
+              <w:t xml:space="preserve">{{salary}}</w:t>
+            </w:r>
+          </w:p>
+        </w:tc>
+      </w:tr>
+      <w:tr>
+        <w:tc>
+          <w:tcPr>
+            <w:tcW w:type="dxa" w:w="3000"/>
+            <w:tcBorders>
+              <w:top w:val="none" w:color="FFFFFF" w:sz="0"/>
+              <w:left w:val="none" w:color="FFFFFF" w:sz="0"/>
+              <w:bottom w:val="single" w:color="e2eaf4" w:sz="1"/>
+              <w:right w:val="none" w:color="FFFFFF" w:sz="0"/>
+            </w:tcBorders>
+            <w:shd w:fill="FFFFFF" w:val="clear"/>
+          </w:tcPr>
+          <w:p>
+            <w:pPr>
+              <w:spacing w:after="100" w:before="100"/>
+              <w:ind w:left="120"/>
+            </w:pPr>
+            <w:r>
+              <w:rPr>
+                <w:rFonts w:ascii="Calibri" w:cs="Calibri" w:eastAsia="Calibri" w:hAnsi="Calibri"/>
+                <w:b/>
+                <w:bCs/>
+                <w:color w:val="1e293b"/>
+                <w:sz w:val="19"/>
+                <w:szCs w:val="19"/>
+              </w:rPr>
+              <w:t xml:space="preserve">Date of Joining</w:t>
+            </w:r>
+          </w:p>
+        </w:tc>
+        <w:tc>
+          <w:tcPr>
+            <w:tcW w:type="dxa" w:w="6360"/>
+            <w:tcBorders>
+              <w:top w:val="none" w:color="FFFFFF" w:sz="0"/>
+              <w:left w:val="none" w:color="FFFFFF" w:sz="0"/>
+              <w:bottom w:val="single" w:color="e2eaf4" w:sz="1"/>
+              <w:right w:val="none" w:color="FFFFFF" w:sz="0"/>
+            </w:tcBorders>
+            <w:shd w:fill="FFFFFF" w:val="clear"/>
+          </w:tcPr>
+          <w:p>
+            <w:pPr>
+              <w:spacing w:after="100" w:before="100"/>
+              <w:ind w:left="120"/>
+            </w:pPr>
+            <w:r>
+              <w:rPr>
+                <w:rFonts w:ascii="Calibri" w:cs="Calibri" w:eastAsia="Calibri" w:hAnsi="Calibri"/>
+                <w:color w:val="1e293b"/>
+                <w:sz w:val="19"/>
+                <w:szCs w:val="19"/>
+              </w:rPr>
+              <w:t xml:space="preserve">{{start_date}}</w:t>
+            </w:r>
+          </w:p>
+        </w:tc>
+      </w:tr>
+      <w:tr>
+        <w:tc>
+          <w:tcPr>
+            <w:tcW w:type="dxa" w:w="3000"/>
+            <w:tcBorders>
+              <w:top w:val="none" w:color="FFFFFF" w:sz="0"/>
+              <w:left w:val="none" w:color="FFFFFF" w:sz="0"/>
+              <w:bottom w:val="single" w:color="e2eaf4" w:sz="1"/>
+              <w:right w:val="none" w:color="FFFFFF" w:sz="0"/>
+            </w:tcBorders>
+            <w:shd w:fill="e8f0fe" w:val="clear"/>
+          </w:tcPr>
+          <w:p>
+            <w:pPr>
+              <w:spacing w:after="100" w:before="100"/>
+              <w:ind w:left="120"/>
+            </w:pPr>
+            <w:r>
+              <w:rPr>
+                <w:rFonts w:ascii="Calibri" w:cs="Calibri" w:eastAsia="Calibri" w:hAnsi="Calibri"/>
+                <w:b/>
+                <w:bCs/>
+                <w:color w:val="1e293b"/>
+                <w:sz w:val="19"/>
+                <w:szCs w:val="19"/>
+              </w:rPr>
+              <w:t xml:space="preserve">Work Location</w:t>
+            </w:r>
+          </w:p>
+        </w:tc>
+        <w:tc>
+          <w:tcPr>
+            <w:tcW w:type="dxa" w:w="6360"/>
+            <w:tcBorders>
+              <w:top w:val="none" w:color="FFFFFF" w:sz="0"/>
+              <w:left w:val="none" w:color="FFFFFF" w:sz="0"/>
+              <w:bottom w:val="single" w:color="e2eaf4" w:sz="1"/>
+              <w:right w:val="none" w:color="FFFFFF" w:sz="0"/>
+            </w:tcBorders>
+            <w:shd w:fill="e8f0fe" w:val="clear"/>
+          </w:tcPr>
+          <w:p>
+            <w:pPr>
+              <w:spacing w:after="100" w:before="100"/>
+              <w:ind w:left="120"/>
+            </w:pPr>
+            <w:r>
+              <w:rPr>
+                <w:rFonts w:ascii="Calibri" w:cs="Calibri" w:eastAsia="Calibri" w:hAnsi="Calibri"/>
+                <w:color w:val="1e293b"/>
+                <w:sz w:val="19"/>
+                <w:szCs w:val="19"/>
+              </w:rPr>
+              <w:t xml:space="preserve">{{location}}</w:t>
+            </w:r>
+          </w:p>
+        </w:tc>
+      </w:tr>
+      <w:tr>
+        <w:tc>
+          <w:tcPr>
+            <w:tcW w:type="dxa" w:w="3000"/>
+            <w:tcBorders>
+              <w:top w:val="none" w:color="FFFFFF" w:sz="0"/>
+              <w:left w:val="none" w:color="FFFFFF" w:sz="0"/>
+              <w:bottom w:val="single" w:color="e2eaf4" w:sz="1"/>
+              <w:right w:val="none" w:color="FFFFFF" w:sz="0"/>
+            </w:tcBorders>
+            <w:shd w:fill="FFFFFF" w:val="clear"/>
+          </w:tcPr>
+          <w:p>
+            <w:pPr>
+              <w:spacing w:after="100" w:before="100"/>
+              <w:ind w:left="120"/>
+            </w:pPr>
+            <w:r>
+              <w:rPr>
+                <w:rFonts w:ascii="Calibri" w:cs="Calibri" w:eastAsia="Calibri" w:hAnsi="Calibri"/>
+                <w:b/>
+                <w:bCs/>
+                <w:color w:val="1e293b"/>
+                <w:sz w:val="19"/>
+                <w:szCs w:val="19"/>
+              </w:rPr>
+              <w:t xml:space="preserve">Probation Period</w:t>
+            </w:r>
+          </w:p>
+        </w:tc>
+        <w:tc>
+          <w:tcPr>
+            <w:tcW w:type="dxa" w:w="6360"/>
+            <w:tcBorders>
+              <w:top w:val="none" w:color="FFFFFF" w:sz="0"/>
+              <w:left w:val="none" w:color="FFFFFF" w:sz="0"/>
+              <w:bottom w:val="single" w:color="e2eaf4" w:sz="1"/>
+              <w:right w:val="none" w:color="FFFFFF" w:sz="0"/>
+            </w:tcBorders>
+            <w:shd w:fill="FFFFFF" w:val="clear"/>
+          </w:tcPr>
+          <w:p>
+            <w:pPr>
+              <w:spacing w:after="100" w:before="100"/>
+              <w:ind w:left="120"/>
+            </w:pPr>
+            <w:r>
+              <w:rPr>
+                <w:rFonts w:ascii="Calibri" w:cs="Calibri" w:eastAsia="Calibri" w:hAnsi="Calibri"/>
+                <w:color w:val="1e293b"/>
+                <w:sz w:val="19"/>
+                <w:szCs w:val="19"/>
+              </w:rPr>
+              <w:t xml:space="preserve">{{probation_period}}</w:t>
+            </w:r>
+          </w:p>
+        </w:tc>
+      </w:tr>
+      <w:tr>
+        <w:tc>
+          <w:tcPr>
+            <w:tcW w:type="dxa" w:w="3000"/>
+            <w:tcBorders>
+              <w:top w:val="none" w:color="FFFFFF" w:sz="0"/>
+              <w:left w:val="none" w:color="FFFFFF" w:sz="0"/>
+              <w:bottom w:val="single" w:color="e2eaf4" w:sz="1"/>
+              <w:right w:val="none" w:color="FFFFFF" w:sz="0"/>
+            </w:tcBorders>
+            <w:shd w:fill="e8f0fe" w:val="clear"/>
+          </w:tcPr>
+          <w:p>
+            <w:pPr>
+              <w:spacing w:after="100" w:before="100"/>
+              <w:ind w:left="120"/>
+            </w:pPr>
+            <w:r>
+              <w:rPr>
+                <w:rFonts w:ascii="Calibri" w:cs="Calibri" w:eastAsia="Calibri" w:hAnsi="Calibri"/>
+                <w:b/>
+                <w:bCs/>
+                <w:color w:val="1e293b"/>
+                <w:sz w:val="19"/>
+                <w:szCs w:val="19"/>
+              </w:rPr>
+              <w:t xml:space="preserve">Reporting To</w:t>
+            </w:r>
+          </w:p>
+        </w:tc>
+        <w:tc>
+          <w:tcPr>
+            <w:tcW w:type="dxa" w:w="6360"/>
+            <w:tcBorders>
+              <w:top w:val="none" w:color="FFFFFF" w:sz="0"/>
+              <w:left w:val="none" w:color="FFFFFF" w:sz="0"/>
+              <w:bottom w:val="single" w:color="e2eaf4" w:sz="1"/>
+              <w:right w:val="none" w:color="FFFFFF" w:sz="0"/>
+            </w:tcBorders>
+            <w:shd w:fill="e8f0fe" w:val="clear"/>
+          </w:tcPr>
+          <w:p>
+            <w:pPr>
+              <w:spacing w:after="100" w:before="100"/>
+              <w:ind w:left="120"/>
+            </w:pPr>
+            <w:r>
+              <w:rPr>
+                <w:rFonts w:ascii="Calibri" w:cs="Calibri" w:eastAsia="Calibri" w:hAnsi="Calibri"/>
+                <w:color w:val="1e293b"/>
+                <w:sz w:val="19"/>
+                <w:szCs w:val="19"/>
+              </w:rPr>
+              <w:t xml:space="preserve">HR Department</w:t>
+            </w:r>
+          </w:p>
+        </w:tc>
+      </w:tr>
+    </w:tbl>
+    <w:p/>
+    <w:p/>
+    <w:p>
+      <w:pPr>
+        <w:spacing w:after="200"/>
+      </w:pPr>
+      <w:r>
+        <w:rPr>
+          <w:rFonts w:ascii="Calibri" w:cs="Calibri" w:eastAsia="Calibri" w:hAnsi="Calibri"/>
+          <w:color w:val="1e293b"/>
+          <w:sz w:val="21"/>
+          <w:szCs w:val="21"/>
+        </w:rPr>
+        <w:t xml:space="preserve">This offer is subject to the successful completion of your probation period of </w:t>
+      </w:r>
+      <w:r>
+        <w:rPr>
+          <w:rFonts w:ascii="Calibri" w:cs="Calibri" w:eastAsia="Calibri" w:hAnsi="Calibri"/>
+          <w:b/>
+          <w:bCs/>
+          <w:color w:val="1e293b"/>
+          <w:sz w:val="21"/>
+          <w:szCs w:val="21"/>
+        </w:rPr>
+        <w:t xml:space="preserve">{{probation_period}}</w:t>
+      </w:r>
+      <w:r>
+        <w:rPr>
+          <w:rFonts w:ascii="Calibri" w:cs="Calibri" w:eastAsia="Calibri" w:hAnsi="Calibri"/>
+          <w:color w:val="1e293b"/>
+          <w:sz w:val="21"/>
+          <w:szCs w:val="21"/>
+        </w:rPr>
+        <w:t xml:space="preserve">, during which your performance will be evaluated against the key objectives of your role.</w:t>
       </w:r>
     </w:p>
     <w:p>
-      <w:r>
-        <w:rPr>
-          <w:color w:val="6B7280"/>
-          <w:sz w:val="20"/>
-          <w:szCs w:val="20"/>
-        </w:rPr>
-        <w:t xml:space="preserve">{{ location }}</w:t>
+      <w:pPr>
+        <w:spacing w:after="200"/>
+      </w:pPr>
+      <w:r>
+        <w:rPr>
+          <w:rFonts w:ascii="Calibri" w:cs="Calibri" w:eastAsia="Calibri" w:hAnsi="Calibri"/>
+          <w:color w:val="1e293b"/>
+          <w:sz w:val="21"/>
+          <w:szCs w:val="21"/>
+        </w:rPr>
+        <w:t xml:space="preserve">Please confirm your acceptance of this offer by signing and returning a copy of this letter within </w:t>
+      </w:r>
+      <w:r>
+        <w:rPr>
+          <w:rFonts w:ascii="Calibri" w:cs="Calibri" w:eastAsia="Calibri" w:hAnsi="Calibri"/>
+          <w:b/>
+          <w:bCs/>
+          <w:color w:val="1e293b"/>
+          <w:sz w:val="21"/>
+          <w:szCs w:val="21"/>
+        </w:rPr>
+        <w:t xml:space="preserve">three (3) working days</w:t>
+      </w:r>
+      <w:r>
+        <w:rPr>
+          <w:rFonts w:ascii="Calibri" w:cs="Calibri" w:eastAsia="Calibri" w:hAnsi="Calibri"/>
+          <w:color w:val="1e293b"/>
+          <w:sz w:val="21"/>
+          <w:szCs w:val="21"/>
+        </w:rPr>
+        <w:t xml:space="preserve"> of receipt. Failure to do so may result in the offer being withdrawn.</w:t>
       </w:r>
     </w:p>
     <w:p>
       <w:pPr>
-        <w:spacing w:after="300"/>
-      </w:pPr>
-      <w:r>
-        <w:rPr>
-          <w:color w:val="6B7280"/>
-          <w:sz w:val="20"/>
-          <w:szCs w:val="20"/>
-        </w:rPr>
-        <w:t xml:space="preserve">Date: {{ offer_date }}</w:t>
-      </w:r>
+        <w:spacing w:after="400"/>
+      </w:pPr>
+      <w:r>
+        <w:rPr>
+          <w:rFonts w:ascii="Calibri" w:cs="Calibri" w:eastAsia="Calibri" w:hAnsi="Calibri"/>
+          <w:color w:val="1e293b"/>
+          <w:sz w:val="21"/>
+          <w:szCs w:val="21"/>
+        </w:rPr>
+        <w:t xml:space="preserve">We look forward to welcoming you to the team and are excited about the contributions you will bring to ORBIT-I.</w:t>
+      </w:r>
+    </w:p>
+    <w:tbl>
+      <w:tblPr>
+        <w:tblW w:type="dxa" w:w="9360"/>
+        <w:tblBorders>
+          <w:top w:val="single" w:color="auto" w:sz="4"/>
+          <w:left w:val="single" w:color="auto" w:sz="4"/>
+          <w:bottom w:val="single" w:color="auto" w:sz="4"/>
+          <w:right w:val="single" w:color="auto" w:sz="4"/>
+          <w:insideH w:val="single" w:color="auto" w:sz="4"/>
+          <w:insideV w:val="single" w:color="auto" w:sz="4"/>
+        </w:tblBorders>
+      </w:tblPr>
+      <w:tblGrid>
+        <w:gridCol w:w="4680"/>
+        <w:gridCol w:w="4680"/>
+      </w:tblGrid>
+      <w:tr>
+        <w:tc>
+          <w:tcPr>
+            <w:tcW w:type="dxa" w:w="4680"/>
+            <w:tcBorders>
+              <w:top w:val="none" w:color="FFFFFF" w:sz="0"/>
+              <w:left w:val="none" w:color="FFFFFF" w:sz="0"/>
+              <w:bottom w:val="none" w:color="FFFFFF" w:sz="0"/>
+              <w:right w:val="none" w:color="FFFFFF" w:sz="0"/>
+            </w:tcBorders>
+          </w:tcPr>
+          <w:p>
+            <w:pPr>
+              <w:spacing w:after="600"/>
+            </w:pPr>
+            <w:r>
+              <w:rPr>
+                <w:rFonts w:ascii="Calibri" w:cs="Calibri" w:eastAsia="Calibri" w:hAnsi="Calibri"/>
+                <w:color w:val="1e293b"/>
+                <w:sz w:val="20"/>
+                <w:szCs w:val="20"/>
+              </w:rPr>
+              <w:t xml:space="preserve">Sincerely,</w:t>
+            </w:r>
+          </w:p>
+          <w:p>
+            <w:r>
+              <w:rPr>
+                <w:rFonts w:ascii="Calibri" w:cs="Calibri" w:eastAsia="Calibri" w:hAnsi="Calibri"/>
+                <w:color w:val="94a3b8"/>
+                <w:sz w:val="20"/>
+                <w:szCs w:val="20"/>
+              </w:rPr>
+              <w:t xml:space="preserve">_______________________</w:t>
+            </w:r>
+          </w:p>
+          <w:p>
+            <w:r>
+              <w:rPr>
+                <w:rFonts w:ascii="Calibri" w:cs="Calibri" w:eastAsia="Calibri" w:hAnsi="Calibri"/>
+                <w:b/>
+                <w:bCs/>
+                <w:color w:val="1e293b"/>
+                <w:sz w:val="20"/>
+                <w:szCs w:val="20"/>
+              </w:rPr>
+              <w:t xml:space="preserve">{{hr_signatory}}</w:t>
+            </w:r>
+          </w:p>
+          <w:p>
+            <w:r>
+              <w:rPr>
+                <w:rFonts w:ascii="Calibri" w:cs="Calibri" w:eastAsia="Calibri" w:hAnsi="Calibri"/>
+                <w:color w:val="64748b"/>
+                <w:sz w:val="18"/>
+                <w:szCs w:val="18"/>
+              </w:rPr>
+              <w:t xml:space="preserve">ORBIT-I</w:t>
+            </w:r>
+          </w:p>
+          <w:p>
+            <w:r>
+              <w:rPr>
+                <w:rFonts w:ascii="Calibri" w:cs="Calibri" w:eastAsia="Calibri" w:hAnsi="Calibri"/>
+                <w:color w:val="94a3b8"/>
+                <w:sz w:val="16"/>
+                <w:szCs w:val="16"/>
+              </w:rPr>
+              <w:t xml:space="preserve">Karachi, Sindh, Pakistan</w:t>
+            </w:r>
+          </w:p>
+        </w:tc>
+        <w:tc>
+          <w:tcPr>
+            <w:tcW w:type="dxa" w:w="4680"/>
+            <w:tcBorders>
+              <w:top w:val="none" w:color="FFFFFF" w:sz="0"/>
+              <w:left w:val="none" w:color="FFFFFF" w:sz="0"/>
+              <w:bottom w:val="none" w:color="FFFFFF" w:sz="0"/>
+              <w:right w:val="none" w:color="FFFFFF" w:sz="0"/>
+            </w:tcBorders>
+          </w:tcPr>
+          <w:p>
+            <w:pPr>
+              <w:spacing w:after="600"/>
+            </w:pPr>
+            <w:r>
+              <w:rPr>
+                <w:rFonts w:ascii="Calibri" w:cs="Calibri" w:eastAsia="Calibri" w:hAnsi="Calibri"/>
+                <w:color w:val="1e293b"/>
+                <w:sz w:val="20"/>
+                <w:szCs w:val="20"/>
+              </w:rPr>
+              <w:t xml:space="preserve">Accepted by:</w:t>
+            </w:r>
+          </w:p>
+          <w:p>
+            <w:r>
+              <w:rPr>
+                <w:rFonts w:ascii="Calibri" w:cs="Calibri" w:eastAsia="Calibri" w:hAnsi="Calibri"/>
+                <w:color w:val="94a3b8"/>
+                <w:sz w:val="20"/>
+                <w:szCs w:val="20"/>
+              </w:rPr>
+              <w:t xml:space="preserve">_______________________</w:t>
+            </w:r>
+          </w:p>
+          <w:p>
+            <w:r>
+              <w:rPr>
+                <w:rFonts w:ascii="Calibri" w:cs="Calibri" w:eastAsia="Calibri" w:hAnsi="Calibri"/>
+                <w:b/>
+                <w:bCs/>
+                <w:color w:val="1e293b"/>
+                <w:sz w:val="20"/>
+                <w:szCs w:val="20"/>
+              </w:rPr>
+              <w:t xml:space="preserve">{{candidate_name}}</w:t>
+            </w:r>
+          </w:p>
+          <w:p>
+            <w:r>
+              <w:rPr>
+                <w:rFonts w:ascii="Calibri" w:cs="Calibri" w:eastAsia="Calibri" w:hAnsi="Calibri"/>
+                <w:color w:val="64748b"/>
+                <w:sz w:val="18"/>
+                <w:szCs w:val="18"/>
+              </w:rPr>
+              <w:t xml:space="preserve">Date: _______________</w:t>
+            </w:r>
+          </w:p>
+        </w:tc>
+      </w:tr>
+    </w:tbl>
+    <w:p/>
+    <w:p/>
+    <w:p>
+      <w:pPr>
+        <w:pBdr>
+          <w:top w:val="single" w:color="d1e3ff" w:sz="1"/>
+        </w:pBdr>
+        <w:spacing w:after="100" w:before="200"/>
+      </w:pPr>
     </w:p>
     <w:p>
       <w:pPr>
-        <w:spacing w:after="200"/>
-      </w:pPr>
-      <w:r>
-        <w:rPr>
-          <w:b/>
-          <w:bCs/>
-          <w:color w:val="17284D"/>
-          <w:sz w:val="22"/>
-          <w:szCs w:val="22"/>
-        </w:rPr>
-        <w:t xml:space="preserve">DEAR {{ candidate_name | upper }},</w:t>
-      </w:r>
-    </w:p>
-    <w:p>
-      <w:pPr>
-        <w:spacing w:after="200"/>
-        <w:jc w:val="both"/>
-      </w:pPr>
-      <w:r>
-        <w:t xml:space="preserve">We are pleased to offer you the position of </w:t>
-      </w:r>
-      <w:r>
-        <w:rPr>
-          <w:b/>
-          <w:bCs/>
-        </w:rPr>
-        <w:t xml:space="preserve">{{ position_title }}</w:t>
-      </w:r>
-      <w:r>
-        <w:t xml:space="preserve"> in the {{ domain }} department at {{ company_name }}, based in {{ location }}. After carefully reviewing your experience and qualifications, we are confident that you will be a valuable addition to our team.</w:t>
-      </w:r>
-    </w:p>
-    <w:p>
-      <w:pPr>
-        <w:spacing w:after="200"/>
-        <w:jc w:val="both"/>
-      </w:pPr>
-      <w:r>
-        <w:t xml:space="preserve">Your monthly salary will be PKR {{ salary }}, and your employment will begin on {{ start_date }}, subject to a probation period of {{ probation_period }}.</w:t>
-      </w:r>
-    </w:p>
-    <w:p>
-      <w:pPr>
-        <w:spacing w:after="400"/>
-        <w:jc w:val="both"/>
-      </w:pPr>
-      <w:r>
-        <w:t xml:space="preserve">We are truly excited about the opportunity to have you join our team and contribute your skills and creativity to our continued growth. Should you have any questions, please feel free to reach out at any time. We look forward to welcoming you and building a successful journey together.</w:t>
-      </w:r>
-    </w:p>
-    <w:p>
-      <w:pPr>
-        <w:spacing w:before="600"/>
-      </w:pPr>
-      <w:r>
-        <w:t xml:space="preserve"/>
-      </w:r>
-    </w:p>
-    <w:p>
-      <w:r>
-        <w:t xml:space="preserve">Regards,</w:t>
-      </w:r>
-    </w:p>
-    <w:p>
-      <w:pPr>
-        <w:spacing w:after="100"/>
-      </w:pPr>
-      <w:r>
-        <w:t xml:space="preserve"/>
-      </w:r>
-    </w:p>
-    <w:p>
-      <w:r>
-        <w:rPr>
-          <w:b/>
-          <w:bCs/>
-        </w:rPr>
-        <w:t xml:space="preserve">{{ hr_signatory }}</w:t>
-      </w:r>
-    </w:p>
-    <w:p>
-      <w:r>
-        <w:rPr>
-          <w:color w:val="6B7280"/>
-          <w:sz w:val="18"/>
-          <w:szCs w:val="18"/>
-        </w:rPr>
-        <w:t xml:space="preserve">HR Department, {{ company_name }}</w:t>
+        <w:jc w:val="center"/>
+      </w:pPr>
+      <w:r>
+        <w:rPr>
+          <w:rFonts w:ascii="Calibri" w:cs="Calibri" w:eastAsia="Calibri" w:hAnsi="Calibri"/>
+          <w:color w:val="94a3b8"/>
+          <w:sz w:val="16"/>
+          <w:szCs w:val="16"/>
+        </w:rPr>
+        <w:t xml:space="preserve">ORBIT-I</w:t>
+      </w:r>
+      <w:r>
+        <w:rPr>
+          <w:rFonts w:ascii="Calibri" w:cs="Calibri" w:eastAsia="Calibri" w:hAnsi="Calibri"/>
+          <w:color w:val="cbd5e1"/>
+          <w:sz w:val="16"/>
+          <w:szCs w:val="16"/>
+        </w:rPr>
+        <w:t xml:space="preserve">  ·  </w:t>
+      </w:r>
+      <w:r>
+        <w:rPr>
+          <w:rFonts w:ascii="Calibri" w:cs="Calibri" w:eastAsia="Calibri" w:hAnsi="Calibri"/>
+          <w:color w:val="94a3b8"/>
+          <w:sz w:val="16"/>
+          <w:szCs w:val="16"/>
+        </w:rPr>
+        <w:t xml:space="preserve">Karachi, Sindh, Pakistan</w:t>
+      </w:r>
+      <w:r>
+        <w:rPr>
+          <w:rFonts w:ascii="Calibri" w:cs="Calibri" w:eastAsia="Calibri" w:hAnsi="Calibri"/>
+          <w:color w:val="cbd5e1"/>
+          <w:sz w:val="16"/>
+          <w:szCs w:val="16"/>
+        </w:rPr>
+        <w:t xml:space="preserve">  ·  </w:t>
+      </w:r>
+      <w:r>
+        <w:rPr>
+          <w:rFonts w:ascii="Calibri" w:cs="Calibri" w:eastAsia="Calibri" w:hAnsi="Calibri"/>
+          <w:color w:val="94a3b8"/>
+          <w:sz w:val="16"/>
+          <w:szCs w:val="16"/>
+        </w:rPr>
+        <w:t xml:space="preserve">orbiti2026@gmail.com</w:t>
+      </w:r>
+      <w:r>
+        <w:rPr>
+          <w:rFonts w:ascii="Calibri" w:cs="Calibri" w:eastAsia="Calibri" w:hAnsi="Calibri"/>
+          <w:color w:val="cbd5e1"/>
+          <w:sz w:val="16"/>
+          <w:szCs w:val="16"/>
+        </w:rPr>
+        <w:t xml:space="preserve">  ·  </w:t>
+      </w:r>
+      <w:r>
+        <w:rPr>
+          <w:rFonts w:ascii="Calibri" w:cs="Calibri" w:eastAsia="Calibri" w:hAnsi="Calibri"/>
+          <w:color w:val="94a3b8"/>
+          <w:sz w:val="16"/>
+          <w:szCs w:val="16"/>
+        </w:rPr>
+        <w:t xml:space="preserve">This document is confidential and intended solely for the named recipient.</w:t>
       </w:r>
     </w:p>
     <w:sectPr>
-      <w:pgSz w:w="12240" w:h="15840" w:orient="portrait"/>
-      <w:pgMar w:top="900" w:right="1000" w:bottom="900" w:left="1000" w:header="708" w:footer="708" w:gutter="0"/>
+      <w:pgSz w:w="11906" w:h="16838" w:orient="portrait"/>
+      <w:pgMar w:top="720" w:right="1080" w:bottom="720" w:left="1080" w:header="708" w:footer="708" w:gutter="0"/>
       <w:pgNumType/>
       <w:docGrid w:linePitch="360"/>
     </w:sectPr>

</xml_diff>